<commit_message>
update to revision 2.0
</commit_message>
<xml_diff>
--- a/template.docx
+++ b/template.docx
@@ -3040,8 +3040,6 @@
     <w:next w:val="BodyText"/>
     <w:link w:val="Heading2Char"/>
     <w:uiPriority w:val="9"/>
-    <w:semiHidden/>
-    <w:unhideWhenUsed/>
     <w:qFormat/>
     <w:rsid w:val="00A10FD9"/>
     <w:pPr>
@@ -3063,8 +3061,6 @@
     <w:next w:val="BodyText"/>
     <w:link w:val="Heading3Char"/>
     <w:uiPriority w:val="9"/>
-    <w:semiHidden/>
-    <w:unhideWhenUsed/>
     <w:qFormat/>
     <w:rsid w:val="00A10FD9"/>
     <w:pPr>
@@ -3516,6 +3512,10 @@
     <w:unhideWhenUsed/>
     <w:qFormat/>
     <w:pPr>
+      <w:pBdr>
+        <w:left w:val="single" w:sz="16" w:space="10" w:color="156082"/>
+      </w:pBdr>
+      <w:shd w:val="clear" w:color="auto" w:fill="EBF3F9"/>
       <w:spacing w:before="100" w:after="100"/>
       <w:ind w:left="480" w:right="480"/>
     </w:pPr>
@@ -3546,14 +3546,26 @@
     <w:qFormat/>
     <w:tblPr>
       <w:tblInd w:w="0" w:type="dxa"/>
+      <w:tblBorders>
+        <w:top w:val="single" w:sz="4" w:space="0" w:color="BFBFBF"/>
+        <w:left w:val="single" w:sz="4" w:space="0" w:color="BFBFBF"/>
+        <w:bottom w:val="single" w:sz="4" w:space="0" w:color="BFBFBF"/>
+        <w:right w:val="single" w:sz="4" w:space="0" w:color="BFBFBF"/>
+        <w:insideH w:val="single" w:sz="4" w:space="0" w:color="BFBFBF"/>
+        <w:insideV w:val="single" w:sz="4" w:space="0" w:color="BFBFBF"/>
+      </w:tblBorders>
       <w:tblCellMar>
-        <w:top w:w="0" w:type="dxa"/>
-        <w:left w:w="108" w:type="dxa"/>
-        <w:bottom w:w="0" w:type="dxa"/>
-        <w:right w:w="108" w:type="dxa"/>
+        <w:top w:w="80" w:type="dxa"/>
+        <w:left w:w="120" w:type="dxa"/>
+        <w:bottom w:w="80" w:type="dxa"/>
+        <w:right w:w="120" w:type="dxa"/>
       </w:tblCellMar>
     </w:tblPr>
     <w:tblStylePr w:type="firstRow">
+      <w:rPr>
+        <w:b/>
+        <w:color w:val="FFFFFF"/>
+      </w:rPr>
       <w:tblPr>
         <w:jc w:val="left"/>
       </w:tblPr>
@@ -3562,9 +3574,10 @@
       </w:trPr>
       <w:tcPr>
         <w:tcBorders>
-          <w:bottom w:val="single" w:sz="0" w:space="0" w:color="auto"/>
+          <w:bottom w:val="single" w:sz="8" w:space="0" w:color="FFFFFF"/>
         </w:tcBorders>
-        <w:vAlign w:val="bottom"/>
+        <w:shd w:val="clear" w:color="auto" w:fill="0F4761"/>
+        <w:vAlign w:val="center"/>
       </w:tcPr>
     </w:tblStylePr>
   </w:style>

</xml_diff>